<commit_message>
docs: complete PR6 verification report
</commit_message>
<xml_diff>
--- a/Отчёты/Практическая работа №6.docx
+++ b/Отчёты/Практическая работа №6.docx
@@ -7957,31 +7957,7 @@
         </w:rPr>
       </w:pPr>
       <w:r>
-        <w:t xml:space="preserve">Pull Request: https://github.com/FireFly4ik/devops-course-2026/pull/2 — влит в main. </w:t>
-      </w:r>
-      <w:r>
-        <w:rPr>
-          <w:lang w:val="ru-RU"/>
-        </w:rPr>
-        <w:t xml:space="preserve">Коммит слияния: </w:t>
-      </w:r>
-      <w:r>
-        <w:t>d</w:t>
-      </w:r>
-      <w:r>
-        <w:rPr>
-          <w:lang w:val="ru-RU"/>
-        </w:rPr>
-        <w:t>61298</w:t>
-      </w:r>
-      <w:r>
-        <w:t>d</w:t>
-      </w:r>
-      <w:r>
-        <w:rPr>
-          <w:lang w:val="ru-RU"/>
-        </w:rPr>
-        <w:t>. Зеркало синхронизировано. Отчёт хранится локально.</w:t>
+        <w:t>Pull Request: https://github.com/FireFly4ik/devops-course-2026/pull/2 — влит в main. Коммит слияния: d61298d. Зеркало синхронизировано. Отчёт опубликован отдельным коммитом с тегом PR6.</w:t>
       </w:r>
     </w:p>
     <w:p>
@@ -8635,91 +8611,7 @@
         </w:rPr>
       </w:pPr>
       <w:r>
-        <w:t xml:space="preserve">Доставка: сначала scripts/deploy.sh --dry-run, затем scripts/deploy.sh. Проверки Git, index.html и HTTPS обязательны. </w:t>
-      </w:r>
-      <w:r>
-        <w:rPr>
-          <w:lang w:val="ru-RU"/>
-        </w:rPr>
-        <w:t xml:space="preserve">Права нормализуются символьной записью </w:t>
-      </w:r>
-      <w:proofErr w:type="spellStart"/>
-      <w:r>
-        <w:t>rsync</w:t>
-      </w:r>
-      <w:proofErr w:type="spellEnd"/>
-      <w:r>
-        <w:rPr>
-          <w:lang w:val="ru-RU"/>
-        </w:rPr>
-        <w:t xml:space="preserve">, совместимой с </w:t>
-      </w:r>
-      <w:r>
-        <w:t>macOS</w:t>
-      </w:r>
-      <w:r>
-        <w:rPr>
-          <w:lang w:val="ru-RU"/>
-        </w:rPr>
-        <w:t xml:space="preserve">. Аудит: </w:t>
-      </w:r>
-      <w:proofErr w:type="spellStart"/>
-      <w:r>
-        <w:t>sudo</w:t>
-      </w:r>
-      <w:proofErr w:type="spellEnd"/>
-      <w:r>
-        <w:rPr>
-          <w:lang w:val="ru-RU"/>
-        </w:rPr>
-        <w:t xml:space="preserve"> </w:t>
-      </w:r>
-      <w:r>
-        <w:t>bash</w:t>
-      </w:r>
-      <w:r>
-        <w:rPr>
-          <w:lang w:val="ru-RU"/>
-        </w:rPr>
-        <w:t xml:space="preserve"> </w:t>
-      </w:r>
-      <w:r>
-        <w:t>scripts</w:t>
-      </w:r>
-      <w:r>
-        <w:rPr>
-          <w:lang w:val="ru-RU"/>
-        </w:rPr>
-        <w:t>/</w:t>
-      </w:r>
-      <w:r>
-        <w:t>audit</w:t>
-      </w:r>
-      <w:r>
-        <w:rPr>
-          <w:lang w:val="ru-RU"/>
-        </w:rPr>
-        <w:t>.</w:t>
-      </w:r>
-      <w:proofErr w:type="spellStart"/>
-      <w:r>
-        <w:t>sh</w:t>
-      </w:r>
-      <w:proofErr w:type="spellEnd"/>
-      <w:r>
-        <w:rPr>
-          <w:lang w:val="ru-RU"/>
-        </w:rPr>
-        <w:t xml:space="preserve">; негативный порог — аргумент 400. Полная инструкция восстановления находится в репозитории и сохранена для </w:t>
-      </w:r>
-      <w:r>
-        <w:t>Ansible</w:t>
-      </w:r>
-      <w:r>
-        <w:rPr>
-          <w:lang w:val="ru-RU"/>
-        </w:rPr>
-        <w:t>-роли последующей работы.</w:t>
+        <w:t>Доставка: сначала scripts/deploy.sh --dry-run, затем scripts/deploy.sh. Проверки Git, index.html и HTTPS обязательны. Права нормализуются символьной записью rsync, совместимой с macOS. Аудит: sudo bash scripts/audit.sh --stage web; негативный порог — аргумент 400. Полная инструкция восстановления находится в репозитории и сохранена для Ansible-роли последующей работы.</w:t>
       </w:r>
     </w:p>
     <w:p>
@@ -9908,6 +9800,102 @@
           <w:lang w:val="ru-RU"/>
         </w:rPr>
         <w:t xml:space="preserve"> зафиксирован отдельно.</w:t>
+      </w:r>
+    </w:p>
+    <w:p>
+      <w:pPr>
+        <w:pStyle w:val="1"/>
+        <w:pageBreakBefore/>
+      </w:pPr>
+      <w:r>
+        <w:t>Дополнительная проверка и актуализация инструкции</w:t>
+      </w:r>
+    </w:p>
+    <w:p>
+      <w:r>
+        <w:t>Аудит получил явный выбор этапа. Для ПР №6 используется --stage web: проверяются SSH, UFW, Nginx, срок сертификата и права. Установка Docker для этого этапа не требуется. Запуск без аргументов по-прежнему проверяет итоговый стенд №7.</w:t>
+      </w:r>
+    </w:p>
+    <w:p>
+      <w:pPr>
+        <w:pStyle w:val="Commands"/>
+        <w:keepLines/>
+        <w:spacing w:after="100"/>
+      </w:pPr>
+      <w:r>
+        <w:t>$ sudo bash /home/devops/audit.sh --stage web</w:t>
+        <w:br/>
+        <w:t>Пройдено: 10, не пройдено: 0</w:t>
+        <w:br/>
+        <w:t>$ echo $?</w:t>
+        <w:br/>
+        <w:t>0</w:t>
+        <w:br/>
+        <w:t># Отрицательный опыт срока сертификата:</w:t>
+        <w:br/>
+        <w:t>$ sudo bash /home/devops/audit.sh --stage web 400</w:t>
+        <w:br/>
+        <w:t>Пройдено: 9, не пройдено: 1</w:t>
+        <w:br/>
+        <w:t>$ echo $?</w:t>
+        <w:br/>
+        <w:t>1</w:t>
+      </w:r>
+    </w:p>
+    <w:p>
+      <w:pPr>
+        <w:keepNext/>
+        <w:jc w:val="center"/>
+      </w:pPr>
+      <w:r>
+        <w:drawing>
+          <wp:inline xmlns:a="http://schemas.openxmlformats.org/drawingml/2006/main" xmlns:pic="http://schemas.openxmlformats.org/drawingml/2006/picture">
+            <wp:extent cx="6120000" cy="2504464"/>
+            <wp:docPr id="1468553569" name="Picture 1468553569"/>
+            <wp:cNvGraphicFramePr>
+              <a:graphicFrameLocks noChangeAspect="1"/>
+            </wp:cNvGraphicFramePr>
+            <a:graphic>
+              <a:graphicData uri="http://schemas.openxmlformats.org/drawingml/2006/picture">
+                <pic:pic>
+                  <pic:nvPicPr>
+                    <pic:cNvPr id="0" name="11-audit-web-negative.png"/>
+                    <pic:cNvPicPr/>
+                  </pic:nvPicPr>
+                  <pic:blipFill>
+                    <a:blip r:embed="rId23"/>
+                    <a:srcRect b="34602"/>
+                    <a:stretch>
+                      <a:fillRect/>
+                    </a:stretch>
+                  </pic:blipFill>
+                  <pic:spPr>
+                    <a:xfrm>
+                      <a:off x="0" y="0"/>
+                      <a:ext cx="6120000" cy="2504464"/>
+                    </a:xfrm>
+                    <a:prstGeom prst="rect"/>
+                  </pic:spPr>
+                </pic:pic>
+              </a:graphicData>
+            </a:graphic>
+          </wp:inline>
+        </w:drawing>
+      </w:r>
+    </w:p>
+    <w:p>
+      <w:pPr>
+        <w:pStyle w:val="af5"/>
+        <w:keepNext w:val="0"/>
+        <w:jc w:val="center"/>
+      </w:pPr>
+      <w:r>
+        <w:t>Отрицательный аудит срока сертификата: ошибка обнаружена</w:t>
+      </w:r>
+    </w:p>
+    <w:p>
+      <w:r>
+        <w:t>Полная инструкция находится в docs/server-setup.md. Отчёт опубликован отдельным коммитом с тегом PR6.</w:t>
       </w:r>
     </w:p>
     <w:sectPr>

</xml_diff>